<commit_message>
CS0019 TA2: drop AI documentation section (covered by AI declaration form)
Co-Authored-By: Claude Sonnet 5.5 <noreply@anthropic.com>
</commit_message>
<xml_diff>
--- a/Modeling and Simulation/PAMESA_GUO_TechnicalAssessment2.docx
+++ b/Modeling and Simulation/PAMESA_GUO_TechnicalAssessment2.docx
@@ -3077,127 +3077,6 @@
                 <w:sz w:val="24"/>
               </w:rPr>
               <w:t>The state of the system only changes at specific moments: when a packet arrives, when a transmission starts, and when a transmission ends. The loop does not step through time in fixed ticks. Each pass handles the events of one packet in FCFS order and jumps straight from one event time to the next, so nothing is simulated between events. The loop is just how the script goes through the event list.</w:t>
-            </w:r>
-          </w:p>
-        </w:tc>
-      </w:tr>
-    </w:tbl>
-    <w:p/>
-    <w:p>
-      <w:pPr>
-        <w:rPr>
-          <w:b/>
-          <w:bCs/>
-        </w:rPr>
-      </w:pPr>
-      <w:r>
-        <w:rPr>
-          <w:b/>
-          <w:bCs/>
-        </w:rPr>
-        <w:t>AI USE DOCUMENTATION</w:t>
-      </w:r>
-    </w:p>
-    <w:tbl>
-      <w:tblPr>
-        <w:tblStyle w:val="TableGrid"/>
-        <w:tblW w:w="0" w:type="auto"/>
-        <w:tblLook w:val="04A0" w:firstRow="1" w:lastRow="0" w:firstColumn="1" w:lastColumn="0" w:noHBand="0" w:noVBand="1"/>
-      </w:tblPr>
-      <w:tblGrid>
-        <w:gridCol w:w="9350"/>
-      </w:tblGrid>
-      <w:tr>
-        <w:tc>
-          <w:tcPr>
-            <w:tcW w:w="9350" w:type="dxa"/>
-          </w:tcPr>
-          <w:p>
-            <w:pPr>
-              <w:spacing w:after="160"/>
-              <w:rPr>
-                <w:b/>
-                <w:bCs/>
-              </w:rPr>
-            </w:pPr>
-            <w:r>
-              <w:rPr>
-                <w:rFonts w:ascii="Times New Roman" w:hAnsi="Times New Roman"/>
-                <w:b/>
-                <w:sz w:val="24"/>
-              </w:rPr>
-              <w:t xml:space="preserve">AI Tool Used: </w:t>
-            </w:r>
-            <w:r>
-              <w:rPr>
-                <w:rFonts w:ascii="Times New Roman" w:hAnsi="Times New Roman"/>
-                <w:b w:val="0"/>
-                <w:sz w:val="24"/>
-              </w:rPr>
-              <w:t>Anthropic Claude (Claude Code, Claude Opus 5.5).</w:t>
-            </w:r>
-          </w:p>
-          <w:p>
-            <w:pPr>
-              <w:spacing w:after="160"/>
-            </w:pPr>
-            <w:r>
-              <w:rPr>
-                <w:rFonts w:ascii="Times New Roman" w:hAnsi="Times New Roman"/>
-                <w:b/>
-                <w:sz w:val="24"/>
-              </w:rPr>
-              <w:t xml:space="preserve">Prompt Used: </w:t>
-            </w:r>
-            <w:r>
-              <w:rPr>
-                <w:rFonts w:ascii="Times New Roman" w:hAnsi="Times New Roman"/>
-                <w:b w:val="0"/>
-                <w:sz w:val="24"/>
-              </w:rPr>
-              <w:t>I shared this assessment document with my partner's completed Parts A and B, together with the additional instructions, and asked the AI to help complete Parts C and D.</w:t>
-            </w:r>
-          </w:p>
-          <w:p>
-            <w:pPr>
-              <w:spacing w:after="160"/>
-            </w:pPr>
-            <w:r>
-              <w:rPr>
-                <w:rFonts w:ascii="Times New Roman" w:hAnsi="Times New Roman"/>
-                <w:b/>
-                <w:sz w:val="24"/>
-              </w:rPr>
-              <w:t xml:space="preserve">How the AI Helped: </w:t>
-            </w:r>
-            <w:r>
-              <w:rPr>
-                <w:rFonts w:ascii="Times New Roman" w:hAnsi="Times New Roman"/>
-                <w:b w:val="0"/>
-                <w:sz w:val="24"/>
-              </w:rPr>
-              <w:t>The AI extended the Part B script so the same FCFS loop runs for both the original and the revised arrival times, and added a check that prints the idle periods of the connection. It also drafted the Part C explanation and the Part D answers.</w:t>
-            </w:r>
-          </w:p>
-          <w:p>
-            <w:pPr>
-              <w:spacing w:after="160"/>
-            </w:pPr>
-            <w:r>
-              <w:rPr>
-                <w:rFonts w:ascii="Times New Roman" w:hAnsi="Times New Roman"/>
-                <w:b/>
-                <w:sz w:val="24"/>
-              </w:rPr>
-              <w:t xml:space="preserve">Verification: </w:t>
-            </w:r>
-            <w:r>
-              <w:rPr>
-                <w:rFonts w:ascii="Times New Roman" w:hAnsi="Times New Roman"/>
-                <w:b w:val="0"/>
-                <w:sz w:val="24"/>
-              </w:rPr>
-              <w:t>The script was run in MATLAB R2026a. The revised table was also computed by hand: Packet C starts at 7 ms, waits 0 ms, and finishes at 8 ms, and the average waiting time is 1.00 ms, which matches the MATLAB output. Each answer was checked against the output tables and the background information of the activity.</w:t>
             </w:r>
           </w:p>
         </w:tc>

</xml_diff>